<commit_message>
Można pobrać wszystkie załączniki ścieżki standardowej po ich zakończeniu
</commit_message>
<xml_diff>
--- a/Projekt/app/docs/Zal_8.docx
+++ b/Projekt/app/docs/Zal_8.docx
@@ -1,6 +1,6 @@
 
 <file path=word/document.xml><?xml version="1.0" encoding="utf-8"?>
-<w:document xmlns:wpc="http://schemas.microsoft.com/office/word/2010/wordprocessingCanvas" xmlns:cx="http://schemas.microsoft.com/office/drawing/2014/chartex" xmlns:cx1="http://schemas.microsoft.com/office/drawing/2015/9/8/chartex" xmlns:cx2="http://schemas.microsoft.com/office/drawing/2015/10/21/chartex" xmlns:cx3="http://schemas.microsoft.com/office/drawing/2016/5/9/chartex" xmlns:cx4="http://schemas.microsoft.com/office/drawing/2016/5/10/chartex" xmlns:cx5="http://schemas.microsoft.com/office/drawing/2016/5/11/chartex" xmlns:cx6="http://schemas.microsoft.com/office/drawing/2016/5/12/chartex" xmlns:cx7="http://schemas.microsoft.com/office/drawing/2016/5/13/chartex" xmlns:cx8="http://schemas.microsoft.com/office/drawing/2016/5/14/chartex" xmlns:mc="http://schemas.openxmlformats.org/markup-compatibility/2006" xmlns:aink="http://schemas.microsoft.com/office/drawing/2016/ink" xmlns:am3d="http://schemas.microsoft.com/office/drawing/2017/model3d" xmlns:o="urn:schemas-microsoft-com:office:office" xmlns:oel="http://schemas.microsoft.com/office/2019/extlst" xmlns:r="http://schemas.openxmlformats.org/officeDocument/2006/relationships" xmlns:m="http://schemas.openxmlformats.org/officeDocument/2006/math" xmlns:v="urn:schemas-microsoft-com:vml" xmlns:wp14="http://schemas.microsoft.com/office/word/2010/wordprocessingDrawing" xmlns:wp="http://schemas.openxmlformats.org/drawingml/2006/wordprocessingDrawing" xmlns:w10="urn:schemas-microsoft-com:office:word" xmlns:w="http://schemas.openxmlformats.org/wordprocessingml/2006/main" xmlns:w14="http://schemas.microsoft.com/office/word/2010/wordml" xmlns:w15="http://schemas.microsoft.com/office/word/2012/wordml" xmlns:w16cex="http://schemas.microsoft.com/office/word/2018/wordml/cex" xmlns:w16cid="http://schemas.microsoft.com/office/word/2016/wordml/cid" xmlns:w16="http://schemas.microsoft.com/office/word/2018/wordml" xmlns:w16du="http://schemas.microsoft.com/office/word/2023/wordml/word16du" xmlns:w16sdtdh="http://schemas.microsoft.com/office/word/2020/wordml/sdtdatahash" xmlns:w16se="http://schemas.microsoft.com/office/word/2015/wordml/symex" xmlns:wpg="http://schemas.microsoft.com/office/word/2010/wordprocessingGroup" xmlns:wpi="http://schemas.microsoft.com/office/word/2010/wordprocessingInk" xmlns:wne="http://schemas.microsoft.com/office/word/2006/wordml" xmlns:wps="http://schemas.microsoft.com/office/word/2010/wordprocessingShape" mc:Ignorable="w14 w15 w16se w16cid w16 w16cex w16sdtdh w16du wp14">
+<w:document xmlns:wpc="http://schemas.microsoft.com/office/word/2010/wordprocessingCanvas" xmlns:cx="http://schemas.microsoft.com/office/drawing/2014/chartex" xmlns:cx1="http://schemas.microsoft.com/office/drawing/2015/9/8/chartex" xmlns:cx2="http://schemas.microsoft.com/office/drawing/2015/10/21/chartex" xmlns:cx3="http://schemas.microsoft.com/office/drawing/2016/5/9/chartex" xmlns:cx4="http://schemas.microsoft.com/office/drawing/2016/5/10/chartex" xmlns:cx5="http://schemas.microsoft.com/office/drawing/2016/5/11/chartex" xmlns:cx6="http://schemas.microsoft.com/office/drawing/2016/5/12/chartex" xmlns:cx7="http://schemas.microsoft.com/office/drawing/2016/5/13/chartex" xmlns:cx8="http://schemas.microsoft.com/office/drawing/2016/5/14/chartex" xmlns:mc="http://schemas.openxmlformats.org/markup-compatibility/2006" xmlns:aink="http://schemas.microsoft.com/office/drawing/2016/ink" xmlns:am3d="http://schemas.microsoft.com/office/drawing/2017/model3d" xmlns:o="urn:schemas-microsoft-com:office:office" xmlns:oel="http://schemas.microsoft.com/office/2019/extlst" xmlns:r="http://schemas.openxmlformats.org/officeDocument/2006/relationships" xmlns:m="http://schemas.openxmlformats.org/officeDocument/2006/math" xmlns:v="urn:schemas-microsoft-com:vml" xmlns:wp14="http://schemas.microsoft.com/office/word/2010/wordprocessingDrawing" xmlns:wp="http://schemas.openxmlformats.org/drawingml/2006/wordprocessingDrawing" xmlns:w10="urn:schemas-microsoft-com:office:word" xmlns:w="http://schemas.openxmlformats.org/wordprocessingml/2006/main" xmlns:w14="http://schemas.microsoft.com/office/word/2010/wordml" xmlns:w15="http://schemas.microsoft.com/office/word/2012/wordml" xmlns:w16cex="http://schemas.microsoft.com/office/word/2018/wordml/cex" xmlns:w16cid="http://schemas.microsoft.com/office/word/2016/wordml/cid" xmlns:w16="http://schemas.microsoft.com/office/word/2018/wordml" xmlns:w16du="http://schemas.microsoft.com/office/word/2023/wordml/word16du" xmlns:w16sdtdh="http://schemas.microsoft.com/office/word/2020/wordml/sdtdatahash" xmlns:w16sdtfl="http://schemas.microsoft.com/office/word/2024/wordml/sdtformatlock" xmlns:w16se="http://schemas.microsoft.com/office/word/2015/wordml/symex" xmlns:wpg="http://schemas.microsoft.com/office/word/2010/wordprocessingGroup" xmlns:wpi="http://schemas.microsoft.com/office/word/2010/wordprocessingInk" xmlns:wne="http://schemas.microsoft.com/office/word/2006/wordml" xmlns:wps="http://schemas.microsoft.com/office/word/2010/wordprocessingShape" mc:Ignorable="w14 w15 w16se w16cid w16 w16cex w16sdtdh w16sdtfl w16du wp14">
   <w:body>
     <w:p>
       <w:pPr>
@@ -93,7 +93,37 @@
           <w:b/>
           <w:bCs/>
         </w:rPr>
-        <w:t>…………</w:t>
+        <w:t xml:space="preserve">{{ </w:t>
+      </w:r>
+      <w:proofErr w:type="spellStart"/>
+      <w:r>
+        <w:rPr>
+          <w:rFonts w:asciiTheme="majorHAnsi" w:hAnsiTheme="majorHAnsi"/>
+          <w:b/>
+          <w:bCs/>
+        </w:rPr>
+        <w:t>imie_nazwisko_studenta</w:t>
+      </w:r>
+      <w:proofErr w:type="spellEnd"/>
+      <w:r>
+        <w:rPr>
+          <w:rFonts w:asciiTheme="majorHAnsi" w:hAnsiTheme="majorHAnsi"/>
+          <w:b/>
+          <w:bCs/>
+        </w:rPr>
+        <w:t xml:space="preserve"> }}</w:t>
+      </w:r>
+      <w:r>
+        <w:rPr>
+          <w:rFonts w:asciiTheme="majorHAnsi" w:hAnsiTheme="majorHAnsi"/>
+        </w:rPr>
+        <w:tab/>
+      </w:r>
+      <w:r>
+        <w:rPr>
+          <w:rFonts w:asciiTheme="majorHAnsi" w:hAnsiTheme="majorHAnsi"/>
+        </w:rPr>
+        <w:t xml:space="preserve"> </w:t>
       </w:r>
       <w:r>
         <w:rPr>
@@ -101,7 +131,13 @@
           <w:b/>
           <w:bCs/>
         </w:rPr>
-        <w:t>.</w:t>
+        <w:t>Nr albumu:</w:t>
+      </w:r>
+      <w:r>
+        <w:rPr>
+          <w:rFonts w:asciiTheme="majorHAnsi" w:hAnsiTheme="majorHAnsi"/>
+        </w:rPr>
+        <w:t xml:space="preserve">  </w:t>
       </w:r>
       <w:r>
         <w:rPr>
@@ -109,45 +145,25 @@
           <w:b/>
           <w:bCs/>
         </w:rPr>
-        <w:t>……………………</w:t>
+        <w:t xml:space="preserve">{{ </w:t>
       </w:r>
+      <w:proofErr w:type="spellStart"/>
       <w:r>
         <w:rPr>
           <w:rFonts w:asciiTheme="majorHAnsi" w:hAnsiTheme="majorHAnsi"/>
           <w:b/>
           <w:bCs/>
         </w:rPr>
-        <w:t>…………………………….………….</w:t>
+        <w:t>nr_indeksu</w:t>
       </w:r>
-      <w:r>
-        <w:rPr>
-          <w:rFonts w:asciiTheme="majorHAnsi" w:hAnsiTheme="majorHAnsi"/>
-        </w:rPr>
-        <w:t xml:space="preserve"> Nr albumu:  </w:t>
-      </w:r>
+      <w:proofErr w:type="spellEnd"/>
       <w:r>
         <w:rPr>
           <w:rFonts w:asciiTheme="majorHAnsi" w:hAnsiTheme="majorHAnsi"/>
           <w:b/>
           <w:bCs/>
         </w:rPr>
-        <w:t>……</w:t>
-      </w:r>
-      <w:r>
-        <w:rPr>
-          <w:rFonts w:asciiTheme="majorHAnsi" w:hAnsiTheme="majorHAnsi"/>
-          <w:b/>
-          <w:bCs/>
-        </w:rPr>
-        <w:t>……….</w:t>
-      </w:r>
-      <w:r>
-        <w:rPr>
-          <w:rFonts w:asciiTheme="majorHAnsi" w:hAnsiTheme="majorHAnsi"/>
-          <w:b/>
-          <w:bCs/>
-        </w:rPr>
-        <w:t>…….</w:t>
+        <w:t xml:space="preserve"> }}</w:t>
       </w:r>
     </w:p>
     <w:tbl>
@@ -165,11 +181,11 @@
         <w:tblLook w:val="04A0" w:firstRow="1" w:lastRow="0" w:firstColumn="1" w:lastColumn="0" w:noHBand="0" w:noVBand="1"/>
       </w:tblPr>
       <w:tblGrid>
-        <w:gridCol w:w="550"/>
-        <w:gridCol w:w="4422"/>
-        <w:gridCol w:w="2871"/>
-        <w:gridCol w:w="1169"/>
-        <w:gridCol w:w="842"/>
+        <w:gridCol w:w="521"/>
+        <w:gridCol w:w="3503"/>
+        <w:gridCol w:w="2397"/>
+        <w:gridCol w:w="695"/>
+        <w:gridCol w:w="2738"/>
       </w:tblGrid>
       <w:tr>
         <w:trPr>
@@ -221,7 +237,7 @@
       </w:tr>
       <w:tr>
         <w:trPr>
-          <w:trHeight w:val="1944"/>
+          <w:trHeight w:val="1278"/>
           <w:jc w:val="center"/>
         </w:trPr>
         <w:tc>
@@ -300,7 +316,7 @@
             <w:tr>
               <w:tc>
                 <w:tcPr>
-                  <w:tcW w:w="552" w:type="dxa"/>
+                  <w:tcW w:w="536" w:type="dxa"/>
                   <w:tcBorders>
                     <w:top w:val="single" w:sz="12" w:space="0" w:color="auto"/>
                     <w:bottom w:val="single" w:sz="12" w:space="0" w:color="auto"/>
@@ -325,7 +341,7 @@
               </w:tc>
               <w:tc>
                 <w:tcPr>
-                  <w:tcW w:w="6804" w:type="dxa"/>
+                  <w:tcW w:w="6382" w:type="dxa"/>
                   <w:tcBorders>
                     <w:top w:val="single" w:sz="12" w:space="0" w:color="auto"/>
                     <w:left w:val="single" w:sz="12" w:space="0" w:color="auto"/>
@@ -460,7 +476,7 @@
               </w:tc>
               <w:tc>
                 <w:tcPr>
-                  <w:tcW w:w="2845" w:type="dxa"/>
+                  <w:tcW w:w="2690" w:type="dxa"/>
                   <w:tcBorders>
                     <w:top w:val="single" w:sz="12" w:space="0" w:color="auto"/>
                     <w:left w:val="single" w:sz="4" w:space="0" w:color="auto"/>
@@ -495,17 +511,18 @@
             <w:tr>
               <w:tc>
                 <w:tcPr>
-                  <w:tcW w:w="552" w:type="dxa"/>
+                  <w:tcW w:w="536" w:type="dxa"/>
                   <w:tcBorders>
                     <w:top w:val="single" w:sz="12" w:space="0" w:color="auto"/>
                     <w:bottom w:val="single" w:sz="4" w:space="0" w:color="auto"/>
                     <w:right w:val="single" w:sz="12" w:space="0" w:color="auto"/>
                   </w:tcBorders>
+                  <w:vAlign w:val="center"/>
                   <w:hideMark/>
                 </w:tcPr>
                 <w:p>
                   <w:pPr>
-                    <w:spacing w:before="120"/>
+                    <w:spacing w:before="40" w:after="120"/>
                     <w:jc w:val="center"/>
                     <w:rPr>
                       <w:rFonts w:asciiTheme="majorHAnsi" w:hAnsiTheme="majorHAnsi" w:cs="Arial"/>
@@ -529,65 +546,18 @@
               </w:tc>
               <w:tc>
                 <w:tcPr>
-                  <w:tcW w:w="6804" w:type="dxa"/>
+                  <w:tcW w:w="6382" w:type="dxa"/>
                   <w:tcBorders>
                     <w:top w:val="single" w:sz="12" w:space="0" w:color="auto"/>
                     <w:left w:val="single" w:sz="12" w:space="0" w:color="auto"/>
                     <w:bottom w:val="single" w:sz="4" w:space="0" w:color="auto"/>
                     <w:right w:val="single" w:sz="4" w:space="0" w:color="auto"/>
                   </w:tcBorders>
+                  <w:vAlign w:val="center"/>
                 </w:tcPr>
                 <w:p>
                   <w:pPr>
-                    <w:spacing w:before="120"/>
-                    <w:rPr>
-                      <w:rFonts w:asciiTheme="majorHAnsi" w:hAnsiTheme="majorHAnsi" w:cs="Arial"/>
-                      <w:b/>
-                      <w:bCs/>
-                      <w:sz w:val="20"/>
-                      <w:lang w:eastAsia="en-US"/>
-                    </w:rPr>
-                  </w:pPr>
-                </w:p>
-              </w:tc>
-              <w:tc>
-                <w:tcPr>
-                  <w:tcW w:w="2845" w:type="dxa"/>
-                  <w:tcBorders>
-                    <w:top w:val="single" w:sz="12" w:space="0" w:color="auto"/>
-                    <w:left w:val="single" w:sz="4" w:space="0" w:color="auto"/>
-                    <w:bottom w:val="single" w:sz="4" w:space="0" w:color="auto"/>
-                  </w:tcBorders>
-                </w:tcPr>
-                <w:p>
-                  <w:pPr>
-                    <w:spacing w:before="120"/>
-                    <w:rPr>
-                      <w:rFonts w:asciiTheme="majorHAnsi" w:hAnsiTheme="majorHAnsi" w:cs="Arial"/>
-                      <w:b/>
-                      <w:bCs/>
-                      <w:sz w:val="20"/>
-                      <w:lang w:eastAsia="en-US"/>
-                    </w:rPr>
-                  </w:pPr>
-                </w:p>
-              </w:tc>
-            </w:tr>
-            <w:tr>
-              <w:tc>
-                <w:tcPr>
-                  <w:tcW w:w="552" w:type="dxa"/>
-                  <w:tcBorders>
-                    <w:top w:val="single" w:sz="4" w:space="0" w:color="auto"/>
-                    <w:bottom w:val="single" w:sz="12" w:space="0" w:color="auto"/>
-                    <w:right w:val="single" w:sz="12" w:space="0" w:color="auto"/>
-                  </w:tcBorders>
-                  <w:hideMark/>
-                </w:tcPr>
-                <w:p>
-                  <w:pPr>
-                    <w:spacing w:before="120"/>
-                    <w:jc w:val="center"/>
+                    <w:spacing w:before="40" w:after="120"/>
                     <w:rPr>
                       <w:rFonts w:asciiTheme="majorHAnsi" w:hAnsiTheme="majorHAnsi" w:cs="Arial"/>
                       <w:b/>
@@ -604,23 +574,45 @@
                       <w:sz w:val="20"/>
                       <w:lang w:eastAsia="en-US"/>
                     </w:rPr>
-                    <w:t>2</w:t>
+                    <w:t xml:space="preserve">{{ </w:t>
+                  </w:r>
+                  <w:proofErr w:type="spellStart"/>
+                  <w:r>
+                    <w:rPr>
+                      <w:rFonts w:asciiTheme="majorHAnsi" w:hAnsiTheme="majorHAnsi" w:cs="Arial"/>
+                      <w:b/>
+                      <w:bCs/>
+                      <w:sz w:val="20"/>
+                      <w:lang w:eastAsia="en-US"/>
+                    </w:rPr>
+                    <w:t>miejsce_praktyki</w:t>
+                  </w:r>
+                  <w:proofErr w:type="spellEnd"/>
+                  <w:r>
+                    <w:rPr>
+                      <w:rFonts w:asciiTheme="majorHAnsi" w:hAnsiTheme="majorHAnsi" w:cs="Arial"/>
+                      <w:b/>
+                      <w:bCs/>
+                      <w:sz w:val="20"/>
+                      <w:lang w:eastAsia="en-US"/>
+                    </w:rPr>
+                    <w:t xml:space="preserve"> }}</w:t>
                   </w:r>
                 </w:p>
               </w:tc>
               <w:tc>
                 <w:tcPr>
-                  <w:tcW w:w="6804" w:type="dxa"/>
+                  <w:tcW w:w="2690" w:type="dxa"/>
                   <w:tcBorders>
-                    <w:top w:val="single" w:sz="4" w:space="0" w:color="auto"/>
-                    <w:left w:val="single" w:sz="12" w:space="0" w:color="auto"/>
-                    <w:bottom w:val="single" w:sz="12" w:space="0" w:color="auto"/>
-                    <w:right w:val="single" w:sz="4" w:space="0" w:color="auto"/>
+                    <w:top w:val="single" w:sz="12" w:space="0" w:color="auto"/>
+                    <w:left w:val="single" w:sz="4" w:space="0" w:color="auto"/>
+                    <w:bottom w:val="single" w:sz="4" w:space="0" w:color="auto"/>
                   </w:tcBorders>
+                  <w:vAlign w:val="center"/>
                 </w:tcPr>
                 <w:p>
                   <w:pPr>
-                    <w:spacing w:before="120"/>
+                    <w:spacing w:before="40" w:after="120"/>
                     <w:rPr>
                       <w:rFonts w:asciiTheme="majorHAnsi" w:hAnsiTheme="majorHAnsi" w:cs="Arial"/>
                       <w:b/>
@@ -629,20 +621,7 @@
                       <w:lang w:eastAsia="en-US"/>
                     </w:rPr>
                   </w:pPr>
-                </w:p>
-              </w:tc>
-              <w:tc>
-                <w:tcPr>
-                  <w:tcW w:w="2845" w:type="dxa"/>
-                  <w:tcBorders>
-                    <w:top w:val="single" w:sz="4" w:space="0" w:color="auto"/>
-                    <w:left w:val="single" w:sz="4" w:space="0" w:color="auto"/>
-                    <w:bottom w:val="single" w:sz="12" w:space="0" w:color="auto"/>
-                  </w:tcBorders>
-                </w:tcPr>
-                <w:p>
-                  <w:pPr>
-                    <w:spacing w:before="120"/>
+                  <w:r>
                     <w:rPr>
                       <w:rFonts w:asciiTheme="majorHAnsi" w:hAnsiTheme="majorHAnsi" w:cs="Arial"/>
                       <w:b/>
@@ -650,7 +629,30 @@
                       <w:sz w:val="20"/>
                       <w:lang w:eastAsia="en-US"/>
                     </w:rPr>
-                  </w:pPr>
+                    <w:t xml:space="preserve">{{ </w:t>
+                  </w:r>
+                  <w:proofErr w:type="spellStart"/>
+                  <w:r>
+                    <w:rPr>
+                      <w:rFonts w:asciiTheme="majorHAnsi" w:hAnsiTheme="majorHAnsi" w:cs="Arial"/>
+                      <w:b/>
+                      <w:bCs/>
+                      <w:sz w:val="20"/>
+                      <w:lang w:eastAsia="en-US"/>
+                    </w:rPr>
+                    <w:t>liczba_dni_roboczych</w:t>
+                  </w:r>
+                  <w:proofErr w:type="spellEnd"/>
+                  <w:r>
+                    <w:rPr>
+                      <w:rFonts w:asciiTheme="majorHAnsi" w:hAnsiTheme="majorHAnsi" w:cs="Arial"/>
+                      <w:b/>
+                      <w:bCs/>
+                      <w:sz w:val="20"/>
+                      <w:lang w:eastAsia="en-US"/>
+                    </w:rPr>
+                    <w:t xml:space="preserve"> }}</w:t>
+                  </w:r>
                 </w:p>
               </w:tc>
             </w:tr>
@@ -746,42 +748,101 @@
                 <w:rFonts w:asciiTheme="majorHAnsi" w:hAnsiTheme="majorHAnsi" w:cs="Arial"/>
                 <w:sz w:val="22"/>
               </w:rPr>
-              <w:t xml:space="preserve">  ..</w:t>
-            </w:r>
-            <w:r>
-              <w:rPr>
-                <w:rFonts w:asciiTheme="majorHAnsi" w:hAnsiTheme="majorHAnsi" w:cs="Arial"/>
-                <w:sz w:val="22"/>
-              </w:rPr>
-              <w:t>............</w:t>
-            </w:r>
-            <w:r>
-              <w:rPr>
-                <w:rFonts w:asciiTheme="majorHAnsi" w:hAnsiTheme="majorHAnsi" w:cs="Arial"/>
-                <w:sz w:val="22"/>
-              </w:rPr>
-              <w:t>...............</w:t>
-            </w:r>
-            <w:r>
-              <w:rPr>
-                <w:rFonts w:asciiTheme="majorHAnsi" w:hAnsiTheme="majorHAnsi" w:cs="Arial"/>
-                <w:sz w:val="22"/>
-              </w:rPr>
-              <w:t>..........            ……………</w:t>
-            </w:r>
-            <w:r>
-              <w:rPr>
-                <w:rFonts w:asciiTheme="majorHAnsi" w:hAnsiTheme="majorHAnsi" w:cs="Arial"/>
-                <w:sz w:val="22"/>
-              </w:rPr>
-              <w:t>…………..</w:t>
-            </w:r>
-            <w:r>
-              <w:rPr>
-                <w:rFonts w:asciiTheme="majorHAnsi" w:hAnsiTheme="majorHAnsi" w:cs="Arial"/>
-                <w:sz w:val="22"/>
-              </w:rPr>
-              <w:t>…………………..</w:t>
+              <w:t xml:space="preserve">  </w:t>
+            </w:r>
+            <w:r>
+              <w:rPr>
+                <w:rFonts w:asciiTheme="majorHAnsi" w:hAnsiTheme="majorHAnsi" w:cs="Arial"/>
+                <w:sz w:val="22"/>
+              </w:rPr>
+              <w:t xml:space="preserve">        </w:t>
+            </w:r>
+            <w:r>
+              <w:rPr>
+                <w:rFonts w:asciiTheme="majorHAnsi" w:hAnsiTheme="majorHAnsi" w:cs="Arial"/>
+                <w:sz w:val="22"/>
+              </w:rPr>
+              <w:t xml:space="preserve">           </w:t>
+            </w:r>
+            <w:r>
+              <w:rPr>
+                <w:rFonts w:asciiTheme="majorHAnsi" w:hAnsiTheme="majorHAnsi" w:cs="Arial"/>
+                <w:b/>
+                <w:bCs/>
+                <w:sz w:val="22"/>
+              </w:rPr>
+              <w:t xml:space="preserve">{{ </w:t>
+            </w:r>
+            <w:proofErr w:type="spellStart"/>
+            <w:r>
+              <w:rPr>
+                <w:rFonts w:asciiTheme="majorHAnsi" w:hAnsiTheme="majorHAnsi" w:cs="Arial"/>
+                <w:b/>
+                <w:bCs/>
+                <w:sz w:val="22"/>
+              </w:rPr>
+              <w:t>ocena_sprawozdania_s</w:t>
+            </w:r>
+            <w:proofErr w:type="spellEnd"/>
+            <w:r>
+              <w:rPr>
+                <w:rFonts w:asciiTheme="majorHAnsi" w:hAnsiTheme="majorHAnsi" w:cs="Arial"/>
+                <w:b/>
+                <w:bCs/>
+                <w:sz w:val="22"/>
+              </w:rPr>
+              <w:t xml:space="preserve"> }}</w:t>
+            </w:r>
+            <w:r>
+              <w:rPr>
+                <w:rFonts w:asciiTheme="majorHAnsi" w:hAnsiTheme="majorHAnsi" w:cs="Arial"/>
+                <w:sz w:val="22"/>
+              </w:rPr>
+              <w:t xml:space="preserve">   </w:t>
+            </w:r>
+            <w:r>
+              <w:rPr>
+                <w:rFonts w:asciiTheme="majorHAnsi" w:hAnsiTheme="majorHAnsi" w:cs="Arial"/>
+                <w:sz w:val="22"/>
+              </w:rPr>
+              <w:t xml:space="preserve">                        </w:t>
+            </w:r>
+            <w:r>
+              <w:rPr>
+                <w:rFonts w:asciiTheme="majorHAnsi" w:hAnsiTheme="majorHAnsi" w:cs="Arial"/>
+                <w:sz w:val="22"/>
+              </w:rPr>
+              <w:t xml:space="preserve">{{ </w:t>
+            </w:r>
+            <w:proofErr w:type="spellStart"/>
+            <w:r>
+              <w:rPr>
+                <w:rFonts w:asciiTheme="majorHAnsi" w:hAnsiTheme="majorHAnsi" w:cs="Arial"/>
+                <w:sz w:val="22"/>
+              </w:rPr>
+              <w:t>data_oceny_s</w:t>
+            </w:r>
+            <w:proofErr w:type="spellEnd"/>
+            <w:r>
+              <w:rPr>
+                <w:rFonts w:asciiTheme="majorHAnsi" w:hAnsiTheme="majorHAnsi" w:cs="Arial"/>
+                <w:sz w:val="22"/>
+              </w:rPr>
+              <w:t xml:space="preserve"> }}</w:t>
+            </w:r>
+            <w:r>
+              <w:rPr>
+                <w:rFonts w:asciiTheme="majorHAnsi" w:hAnsiTheme="majorHAnsi" w:cs="Arial"/>
+                <w:sz w:val="22"/>
+              </w:rPr>
+              <w:t xml:space="preserve">, </w:t>
+            </w:r>
+            <w:r>
+              <w:rPr>
+                <w:rFonts w:asciiTheme="majorHAnsi" w:hAnsiTheme="majorHAnsi" w:cs="Arial"/>
+                <w:sz w:val="22"/>
+              </w:rPr>
+              <w:t>{{ imie_nazwisko_2 }}</w:t>
             </w:r>
             <w:r>
               <w:rPr>
@@ -920,6 +981,44 @@
               </w:rPr>
               <w:t>* =</w:t>
             </w:r>
+            <w:r>
+              <w:rPr>
+                <w:rFonts w:asciiTheme="majorHAnsi" w:hAnsiTheme="majorHAnsi" w:cs="Arial"/>
+                <w:b/>
+                <w:sz w:val="22"/>
+                <w:szCs w:val="24"/>
+              </w:rPr>
+              <w:t xml:space="preserve"> </w:t>
+            </w:r>
+            <w:r>
+              <w:rPr>
+                <w:rFonts w:asciiTheme="majorHAnsi" w:hAnsiTheme="majorHAnsi" w:cs="Arial"/>
+                <w:b/>
+                <w:sz w:val="22"/>
+                <w:szCs w:val="24"/>
+              </w:rPr>
+              <w:t xml:space="preserve">{{ </w:t>
+            </w:r>
+            <w:proofErr w:type="spellStart"/>
+            <w:r>
+              <w:rPr>
+                <w:rFonts w:asciiTheme="majorHAnsi" w:hAnsiTheme="majorHAnsi" w:cs="Arial"/>
+                <w:b/>
+                <w:sz w:val="22"/>
+                <w:szCs w:val="24"/>
+              </w:rPr>
+              <w:t>ocena_u</w:t>
+            </w:r>
+            <w:proofErr w:type="spellEnd"/>
+            <w:r>
+              <w:rPr>
+                <w:rFonts w:asciiTheme="majorHAnsi" w:hAnsiTheme="majorHAnsi" w:cs="Arial"/>
+                <w:b/>
+                <w:sz w:val="22"/>
+                <w:szCs w:val="24"/>
+              </w:rPr>
+              <w:t xml:space="preserve"> }}</w:t>
+            </w:r>
           </w:p>
         </w:tc>
         <w:tc>
@@ -943,6 +1042,7 @@
                 <w:rFonts w:asciiTheme="majorHAnsi" w:hAnsiTheme="majorHAnsi" w:cs="Arial"/>
                 <w:b/>
                 <w:sz w:val="22"/>
+                <w:szCs w:val="24"/>
               </w:rPr>
             </w:pPr>
             <w:r>
@@ -971,6 +1071,44 @@
                 <w:szCs w:val="24"/>
               </w:rPr>
               <w:t>* =</w:t>
+            </w:r>
+            <w:r>
+              <w:rPr>
+                <w:rFonts w:asciiTheme="majorHAnsi" w:hAnsiTheme="majorHAnsi" w:cs="Arial"/>
+                <w:b/>
+                <w:sz w:val="22"/>
+                <w:szCs w:val="24"/>
+              </w:rPr>
+              <w:t xml:space="preserve"> </w:t>
+            </w:r>
+            <w:r>
+              <w:rPr>
+                <w:rFonts w:asciiTheme="majorHAnsi" w:hAnsiTheme="majorHAnsi" w:cs="Arial"/>
+                <w:b/>
+                <w:sz w:val="22"/>
+                <w:szCs w:val="24"/>
+              </w:rPr>
+              <w:t xml:space="preserve">{{ </w:t>
+            </w:r>
+            <w:proofErr w:type="spellStart"/>
+            <w:r>
+              <w:rPr>
+                <w:rFonts w:asciiTheme="majorHAnsi" w:hAnsiTheme="majorHAnsi" w:cs="Arial"/>
+                <w:b/>
+                <w:sz w:val="22"/>
+                <w:szCs w:val="24"/>
+              </w:rPr>
+              <w:t>ocena_z</w:t>
+            </w:r>
+            <w:proofErr w:type="spellEnd"/>
+            <w:r>
+              <w:rPr>
+                <w:rFonts w:asciiTheme="majorHAnsi" w:hAnsiTheme="majorHAnsi" w:cs="Arial"/>
+                <w:b/>
+                <w:sz w:val="22"/>
+                <w:szCs w:val="24"/>
+              </w:rPr>
+              <w:t xml:space="preserve"> }}</w:t>
             </w:r>
           </w:p>
         </w:tc>
@@ -1057,23 +1195,15 @@
                 <w:sz w:val="22"/>
                 <w:szCs w:val="22"/>
               </w:rPr>
-              <w:t>: ....................</w:t>
-            </w:r>
-            <w:r>
-              <w:rPr>
-                <w:rFonts w:asciiTheme="majorHAnsi" w:hAnsiTheme="majorHAnsi" w:cs="Arial"/>
-                <w:sz w:val="22"/>
-                <w:szCs w:val="22"/>
-              </w:rPr>
-              <w:t>....................</w:t>
-            </w:r>
-            <w:r>
-              <w:rPr>
-                <w:rFonts w:asciiTheme="majorHAnsi" w:hAnsiTheme="majorHAnsi" w:cs="Arial"/>
-                <w:sz w:val="22"/>
-                <w:szCs w:val="22"/>
-              </w:rPr>
-              <w:t>...........</w:t>
+              <w:t xml:space="preserve">: </w:t>
+            </w:r>
+            <w:r>
+              <w:rPr>
+                <w:rFonts w:asciiTheme="majorHAnsi" w:hAnsiTheme="majorHAnsi" w:cs="Arial"/>
+                <w:sz w:val="22"/>
+                <w:szCs w:val="22"/>
+              </w:rPr>
+              <w:t>{{ data_zaliczenia }}</w:t>
             </w:r>
           </w:p>
           <w:p>
@@ -1098,15 +1228,39 @@
                 <w:sz w:val="22"/>
                 <w:szCs w:val="22"/>
               </w:rPr>
-              <w:t>.................................................................</w:t>
-            </w:r>
-            <w:r>
-              <w:rPr>
-                <w:rFonts w:asciiTheme="majorHAnsi" w:hAnsiTheme="majorHAnsi" w:cs="Arial"/>
-                <w:sz w:val="22"/>
-                <w:szCs w:val="22"/>
-              </w:rPr>
-              <w:t xml:space="preserve">.............       —   </w:t>
+              <w:t>{{ imie_nazwisko_</w:t>
+            </w:r>
+            <w:r>
+              <w:rPr>
+                <w:rFonts w:asciiTheme="majorHAnsi" w:hAnsiTheme="majorHAnsi" w:cs="Arial"/>
+                <w:sz w:val="22"/>
+                <w:szCs w:val="22"/>
+              </w:rPr>
+              <w:t>1</w:t>
+            </w:r>
+            <w:r>
+              <w:rPr>
+                <w:rFonts w:asciiTheme="majorHAnsi" w:hAnsiTheme="majorHAnsi" w:cs="Arial"/>
+                <w:sz w:val="22"/>
+                <w:szCs w:val="22"/>
+              </w:rPr>
+              <w:t xml:space="preserve"> }}</w:t>
+            </w:r>
+            <w:r>
+              <w:rPr>
+                <w:rFonts w:asciiTheme="majorHAnsi" w:hAnsiTheme="majorHAnsi" w:cs="Arial"/>
+                <w:sz w:val="22"/>
+                <w:szCs w:val="22"/>
+              </w:rPr>
+              <w:t xml:space="preserve">       </w:t>
+            </w:r>
+            <w:r>
+              <w:rPr>
+                <w:rFonts w:asciiTheme="majorHAnsi" w:hAnsiTheme="majorHAnsi" w:cs="Arial"/>
+                <w:sz w:val="22"/>
+                <w:szCs w:val="22"/>
+              </w:rPr>
+              <w:t xml:space="preserve">—   </w:t>
             </w:r>
             <w:r>
               <w:rPr>
@@ -1139,15 +1293,15 @@
                 <w:sz w:val="22"/>
                 <w:szCs w:val="22"/>
               </w:rPr>
-              <w:t>..........................................................................</w:t>
-            </w:r>
-            <w:r>
-              <w:rPr>
-                <w:rFonts w:asciiTheme="majorHAnsi" w:hAnsiTheme="majorHAnsi" w:cs="Arial"/>
-                <w:sz w:val="22"/>
-                <w:szCs w:val="22"/>
-              </w:rPr>
-              <w:t xml:space="preserve">....       —   </w:t>
+              <w:t>{{ imie_nazwisko_2 }}</w:t>
+            </w:r>
+            <w:r>
+              <w:rPr>
+                <w:rFonts w:asciiTheme="majorHAnsi" w:hAnsiTheme="majorHAnsi" w:cs="Arial"/>
+                <w:sz w:val="22"/>
+                <w:szCs w:val="22"/>
+              </w:rPr>
+              <w:t xml:space="preserve">       —   </w:t>
             </w:r>
             <w:r>
               <w:rPr>
@@ -1177,15 +1331,31 @@
                 <w:sz w:val="22"/>
                 <w:szCs w:val="22"/>
               </w:rPr>
-              <w:t>.......................................................</w:t>
-            </w:r>
-            <w:r>
-              <w:rPr>
-                <w:rFonts w:asciiTheme="majorHAnsi" w:hAnsiTheme="majorHAnsi" w:cs="Arial"/>
-                <w:sz w:val="22"/>
-                <w:szCs w:val="22"/>
-              </w:rPr>
-              <w:t xml:space="preserve">.......................       —  </w:t>
+              <w:t>{{ imie_nazwisko_</w:t>
+            </w:r>
+            <w:r>
+              <w:rPr>
+                <w:rFonts w:asciiTheme="majorHAnsi" w:hAnsiTheme="majorHAnsi" w:cs="Arial"/>
+                <w:sz w:val="22"/>
+                <w:szCs w:val="22"/>
+              </w:rPr>
+              <w:t>3</w:t>
+            </w:r>
+            <w:r>
+              <w:rPr>
+                <w:rFonts w:asciiTheme="majorHAnsi" w:hAnsiTheme="majorHAnsi" w:cs="Arial"/>
+                <w:sz w:val="22"/>
+                <w:szCs w:val="22"/>
+              </w:rPr>
+              <w:t xml:space="preserve"> }}</w:t>
+            </w:r>
+            <w:r>
+              <w:rPr>
+                <w:rFonts w:asciiTheme="majorHAnsi" w:hAnsiTheme="majorHAnsi" w:cs="Arial"/>
+                <w:sz w:val="22"/>
+                <w:szCs w:val="22"/>
+              </w:rPr>
+              <w:t xml:space="preserve">       —  </w:t>
             </w:r>
             <w:r>
               <w:rPr>
@@ -1201,23 +1371,7 @@
                 <w:sz w:val="22"/>
                 <w:szCs w:val="22"/>
               </w:rPr>
-              <w:t>…………………………………………</w:t>
-            </w:r>
-            <w:r>
-              <w:rPr>
-                <w:rFonts w:asciiTheme="majorHAnsi" w:hAnsiTheme="majorHAnsi" w:cs="Arial"/>
-                <w:sz w:val="22"/>
-                <w:szCs w:val="22"/>
-              </w:rPr>
-              <w:t>………………</w:t>
-            </w:r>
-            <w:r>
-              <w:rPr>
-                <w:rFonts w:asciiTheme="majorHAnsi" w:hAnsiTheme="majorHAnsi" w:cs="Arial"/>
-                <w:sz w:val="22"/>
-                <w:szCs w:val="22"/>
-              </w:rPr>
-              <w:t>…..</w:t>
+              <w:t>{{ funkcja_3 }}</w:t>
             </w:r>
           </w:p>
           <w:p>
@@ -1230,6 +1384,8 @@
               <w:spacing w:before="120"/>
               <w:rPr>
                 <w:rFonts w:asciiTheme="majorHAnsi" w:hAnsiTheme="majorHAnsi" w:cs="Arial"/>
+                <w:sz w:val="22"/>
+                <w:szCs w:val="22"/>
               </w:rPr>
             </w:pPr>
             <w:r>
@@ -1238,15 +1394,15 @@
                 <w:sz w:val="22"/>
                 <w:szCs w:val="22"/>
               </w:rPr>
-              <w:t>…………………………………………………</w:t>
-            </w:r>
-            <w:r>
-              <w:rPr>
-                <w:rFonts w:asciiTheme="majorHAnsi" w:hAnsiTheme="majorHAnsi" w:cs="Arial"/>
-                <w:sz w:val="22"/>
-                <w:szCs w:val="22"/>
-              </w:rPr>
-              <w:t xml:space="preserve">…….       — </w:t>
+              <w:t>{{ imie_nazwisko_2 }}</w:t>
+            </w:r>
+            <w:r>
+              <w:rPr>
+                <w:rFonts w:asciiTheme="majorHAnsi" w:hAnsiTheme="majorHAnsi" w:cs="Arial"/>
+                <w:sz w:val="22"/>
+                <w:szCs w:val="22"/>
+              </w:rPr>
+              <w:t xml:space="preserve">       — </w:t>
             </w:r>
             <w:r>
               <w:rPr>
@@ -1262,23 +1418,15 @@
                 <w:sz w:val="22"/>
                 <w:szCs w:val="22"/>
               </w:rPr>
-              <w:t xml:space="preserve"> …………………</w:t>
-            </w:r>
-            <w:r>
-              <w:rPr>
-                <w:rFonts w:asciiTheme="majorHAnsi" w:hAnsiTheme="majorHAnsi" w:cs="Arial"/>
-                <w:sz w:val="22"/>
-                <w:szCs w:val="22"/>
-              </w:rPr>
-              <w:t>………………</w:t>
-            </w:r>
-            <w:r>
-              <w:rPr>
-                <w:rFonts w:asciiTheme="majorHAnsi" w:hAnsiTheme="majorHAnsi" w:cs="Arial"/>
-                <w:sz w:val="22"/>
-                <w:szCs w:val="22"/>
-              </w:rPr>
-              <w:t>…………………………..</w:t>
+              <w:t xml:space="preserve"> </w:t>
+            </w:r>
+            <w:r>
+              <w:rPr>
+                <w:rFonts w:asciiTheme="majorHAnsi" w:hAnsiTheme="majorHAnsi" w:cs="Arial"/>
+                <w:sz w:val="22"/>
+                <w:szCs w:val="22"/>
+              </w:rPr>
+              <w:t>{{ funkcja_4 }}</w:t>
             </w:r>
           </w:p>
         </w:tc>
@@ -1458,6 +1606,7 @@
           <w:tcPr>
             <w:tcW w:w="4294" w:type="pct"/>
             <w:gridSpan w:val="3"/>
+            <w:vAlign w:val="center"/>
           </w:tcPr>
           <w:p>
             <w:pPr>
@@ -1469,6 +1618,14 @@
                 <w:szCs w:val="22"/>
               </w:rPr>
             </w:pPr>
+            <w:r>
+              <w:rPr>
+                <w:rFonts w:asciiTheme="majorHAnsi" w:hAnsiTheme="majorHAnsi" w:cs="Arial"/>
+                <w:sz w:val="22"/>
+                <w:szCs w:val="22"/>
+              </w:rPr>
+              <w:t>{{ pytanie_1 }}</w:t>
+            </w:r>
           </w:p>
         </w:tc>
         <w:tc>
@@ -1491,6 +1648,14 @@
                 <w:szCs w:val="22"/>
               </w:rPr>
             </w:pPr>
+            <w:r>
+              <w:rPr>
+                <w:rFonts w:asciiTheme="majorHAnsi" w:hAnsiTheme="majorHAnsi" w:cs="Arial"/>
+                <w:sz w:val="22"/>
+                <w:szCs w:val="22"/>
+              </w:rPr>
+              <w:t>{{ ocena_cz_1 }}</w:t>
+            </w:r>
           </w:p>
         </w:tc>
       </w:tr>
@@ -1532,6 +1697,7 @@
           <w:tcPr>
             <w:tcW w:w="4294" w:type="pct"/>
             <w:gridSpan w:val="3"/>
+            <w:vAlign w:val="center"/>
           </w:tcPr>
           <w:p>
             <w:pPr>
@@ -1543,6 +1709,30 @@
                 <w:szCs w:val="22"/>
               </w:rPr>
             </w:pPr>
+            <w:r>
+              <w:rPr>
+                <w:rFonts w:asciiTheme="majorHAnsi" w:hAnsiTheme="majorHAnsi" w:cs="Arial"/>
+                <w:sz w:val="22"/>
+                <w:szCs w:val="22"/>
+              </w:rPr>
+              <w:t>{{ pytanie_</w:t>
+            </w:r>
+            <w:r>
+              <w:rPr>
+                <w:rFonts w:asciiTheme="majorHAnsi" w:hAnsiTheme="majorHAnsi" w:cs="Arial"/>
+                <w:sz w:val="22"/>
+                <w:szCs w:val="22"/>
+              </w:rPr>
+              <w:t>2</w:t>
+            </w:r>
+            <w:r>
+              <w:rPr>
+                <w:rFonts w:asciiTheme="majorHAnsi" w:hAnsiTheme="majorHAnsi" w:cs="Arial"/>
+                <w:sz w:val="22"/>
+                <w:szCs w:val="22"/>
+              </w:rPr>
+              <w:t xml:space="preserve"> }}</w:t>
+            </w:r>
           </w:p>
         </w:tc>
         <w:tc>
@@ -1565,6 +1755,30 @@
                 <w:szCs w:val="22"/>
               </w:rPr>
             </w:pPr>
+            <w:r>
+              <w:rPr>
+                <w:rFonts w:asciiTheme="majorHAnsi" w:hAnsiTheme="majorHAnsi" w:cs="Arial"/>
+                <w:sz w:val="22"/>
+                <w:szCs w:val="22"/>
+              </w:rPr>
+              <w:t>{{ ocena_cz_</w:t>
+            </w:r>
+            <w:r>
+              <w:rPr>
+                <w:rFonts w:asciiTheme="majorHAnsi" w:hAnsiTheme="majorHAnsi" w:cs="Arial"/>
+                <w:sz w:val="22"/>
+                <w:szCs w:val="22"/>
+              </w:rPr>
+              <w:t>2</w:t>
+            </w:r>
+            <w:r>
+              <w:rPr>
+                <w:rFonts w:asciiTheme="majorHAnsi" w:hAnsiTheme="majorHAnsi" w:cs="Arial"/>
+                <w:sz w:val="22"/>
+                <w:szCs w:val="22"/>
+              </w:rPr>
+              <w:t xml:space="preserve"> }}</w:t>
+            </w:r>
           </w:p>
         </w:tc>
       </w:tr>
@@ -1610,6 +1824,7 @@
             <w:tcBorders>
               <w:bottom w:val="single" w:sz="4" w:space="0" w:color="auto"/>
             </w:tcBorders>
+            <w:vAlign w:val="center"/>
           </w:tcPr>
           <w:p>
             <w:pPr>
@@ -1621,6 +1836,30 @@
                 <w:szCs w:val="22"/>
               </w:rPr>
             </w:pPr>
+            <w:r>
+              <w:rPr>
+                <w:rFonts w:asciiTheme="majorHAnsi" w:hAnsiTheme="majorHAnsi" w:cs="Arial"/>
+                <w:sz w:val="22"/>
+                <w:szCs w:val="22"/>
+              </w:rPr>
+              <w:t>{{ pytanie_</w:t>
+            </w:r>
+            <w:r>
+              <w:rPr>
+                <w:rFonts w:asciiTheme="majorHAnsi" w:hAnsiTheme="majorHAnsi" w:cs="Arial"/>
+                <w:sz w:val="22"/>
+                <w:szCs w:val="22"/>
+              </w:rPr>
+              <w:t>3</w:t>
+            </w:r>
+            <w:r>
+              <w:rPr>
+                <w:rFonts w:asciiTheme="majorHAnsi" w:hAnsiTheme="majorHAnsi" w:cs="Arial"/>
+                <w:sz w:val="22"/>
+                <w:szCs w:val="22"/>
+              </w:rPr>
+              <w:t xml:space="preserve"> }}</w:t>
+            </w:r>
           </w:p>
         </w:tc>
         <w:tc>
@@ -1644,6 +1883,30 @@
                 <w:szCs w:val="22"/>
               </w:rPr>
             </w:pPr>
+            <w:r>
+              <w:rPr>
+                <w:rFonts w:asciiTheme="majorHAnsi" w:hAnsiTheme="majorHAnsi" w:cs="Arial"/>
+                <w:sz w:val="22"/>
+                <w:szCs w:val="22"/>
+              </w:rPr>
+              <w:t>{{ ocena_cz_</w:t>
+            </w:r>
+            <w:r>
+              <w:rPr>
+                <w:rFonts w:asciiTheme="majorHAnsi" w:hAnsiTheme="majorHAnsi" w:cs="Arial"/>
+                <w:sz w:val="22"/>
+                <w:szCs w:val="22"/>
+              </w:rPr>
+              <w:t>3</w:t>
+            </w:r>
+            <w:r>
+              <w:rPr>
+                <w:rFonts w:asciiTheme="majorHAnsi" w:hAnsiTheme="majorHAnsi" w:cs="Arial"/>
+                <w:sz w:val="22"/>
+                <w:szCs w:val="22"/>
+              </w:rPr>
+              <w:t xml:space="preserve"> }}</w:t>
+            </w:r>
           </w:p>
         </w:tc>
       </w:tr>
@@ -1747,7 +2010,7 @@
           <w:p>
             <w:pPr>
               <w:pStyle w:val="NormalnyWeb"/>
-              <w:spacing w:line="360" w:lineRule="auto"/>
+              <w:spacing w:before="120" w:line="360" w:lineRule="auto"/>
               <w:jc w:val="center"/>
               <w:rPr>
                 <w:rFonts w:asciiTheme="majorHAnsi" w:hAnsiTheme="majorHAnsi" w:cs="Arial"/>
@@ -1763,7 +2026,27 @@
                 <w:sz w:val="22"/>
                 <w:szCs w:val="22"/>
               </w:rPr>
-              <w:t>……...</w:t>
+              <w:t xml:space="preserve">{{ </w:t>
+            </w:r>
+            <w:proofErr w:type="spellStart"/>
+            <w:r>
+              <w:rPr>
+                <w:rFonts w:asciiTheme="majorHAnsi" w:hAnsiTheme="majorHAnsi" w:cs="Arial"/>
+                <w:b/>
+                <w:sz w:val="22"/>
+                <w:szCs w:val="22"/>
+              </w:rPr>
+              <w:t>ocena_za_mini_zadania_e</w:t>
+            </w:r>
+            <w:proofErr w:type="spellEnd"/>
+            <w:r>
+              <w:rPr>
+                <w:rFonts w:asciiTheme="majorHAnsi" w:hAnsiTheme="majorHAnsi" w:cs="Arial"/>
+                <w:b/>
+                <w:sz w:val="22"/>
+                <w:szCs w:val="22"/>
+              </w:rPr>
+              <w:t xml:space="preserve"> }}</w:t>
             </w:r>
           </w:p>
         </w:tc>
@@ -1901,7 +2184,7 @@
           <w:p>
             <w:pPr>
               <w:pStyle w:val="NormalnyWeb"/>
-              <w:spacing w:line="360" w:lineRule="auto"/>
+              <w:spacing w:before="120" w:line="360" w:lineRule="auto"/>
               <w:jc w:val="center"/>
               <w:rPr>
                 <w:rFonts w:asciiTheme="majorHAnsi" w:hAnsiTheme="majorHAnsi" w:cs="Arial"/>
@@ -1917,7 +2200,27 @@
                 <w:sz w:val="22"/>
                 <w:szCs w:val="22"/>
               </w:rPr>
-              <w:t>……...</w:t>
+              <w:t xml:space="preserve">{{ </w:t>
+            </w:r>
+            <w:proofErr w:type="spellStart"/>
+            <w:r>
+              <w:rPr>
+                <w:rFonts w:asciiTheme="majorHAnsi" w:hAnsiTheme="majorHAnsi" w:cs="Arial"/>
+                <w:b/>
+                <w:sz w:val="22"/>
+                <w:szCs w:val="22"/>
+              </w:rPr>
+              <w:t>ocena_koncowa</w:t>
+            </w:r>
+            <w:proofErr w:type="spellEnd"/>
+            <w:r>
+              <w:rPr>
+                <w:rFonts w:asciiTheme="majorHAnsi" w:hAnsiTheme="majorHAnsi" w:cs="Arial"/>
+                <w:b/>
+                <w:sz w:val="22"/>
+                <w:szCs w:val="22"/>
+              </w:rPr>
+              <w:t xml:space="preserve"> }}</w:t>
             </w:r>
           </w:p>
         </w:tc>
@@ -2014,16 +2317,27 @@
                 <w:sz w:val="22"/>
                 <w:szCs w:val="22"/>
               </w:rPr>
-              <w:t>……………</w:t>
-            </w:r>
-            <w:r>
-              <w:rPr>
-                <w:rFonts w:asciiTheme="majorHAnsi" w:hAnsiTheme="majorHAnsi" w:cs="Arial"/>
-                <w:b/>
-                <w:sz w:val="22"/>
-                <w:szCs w:val="22"/>
-              </w:rPr>
-              <w:t>…………</w:t>
+              <w:t xml:space="preserve">{{ </w:t>
+            </w:r>
+            <w:proofErr w:type="spellStart"/>
+            <w:r>
+              <w:rPr>
+                <w:rFonts w:asciiTheme="majorHAnsi" w:hAnsiTheme="majorHAnsi" w:cs="Arial"/>
+                <w:b/>
+                <w:sz w:val="22"/>
+                <w:szCs w:val="22"/>
+              </w:rPr>
+              <w:t>ocena_koncowa</w:t>
+            </w:r>
+            <w:proofErr w:type="spellEnd"/>
+            <w:r>
+              <w:rPr>
+                <w:rFonts w:asciiTheme="majorHAnsi" w:hAnsiTheme="majorHAnsi" w:cs="Arial"/>
+                <w:b/>
+                <w:sz w:val="22"/>
+                <w:szCs w:val="22"/>
+              </w:rPr>
+              <w:t xml:space="preserve"> }}</w:t>
             </w:r>
           </w:p>
           <w:p>
@@ -2081,7 +2395,23 @@
                 <w:sz w:val="22"/>
                 <w:szCs w:val="22"/>
               </w:rPr>
-              <w:t>………………………………………………</w:t>
+              <w:t>{{ imie_nazwisko_</w:t>
+            </w:r>
+            <w:r>
+              <w:rPr>
+                <w:rFonts w:asciiTheme="majorHAnsi" w:hAnsiTheme="majorHAnsi" w:cs="Arial"/>
+                <w:sz w:val="22"/>
+                <w:szCs w:val="22"/>
+              </w:rPr>
+              <w:t>1</w:t>
+            </w:r>
+            <w:r>
+              <w:rPr>
+                <w:rFonts w:asciiTheme="majorHAnsi" w:hAnsiTheme="majorHAnsi" w:cs="Arial"/>
+                <w:sz w:val="22"/>
+                <w:szCs w:val="22"/>
+              </w:rPr>
+              <w:t xml:space="preserve"> }}</w:t>
             </w:r>
           </w:p>
           <w:p>
@@ -2173,67 +2503,7 @@
               <w:rPr>
                 <w:rFonts w:asciiTheme="majorHAnsi" w:hAnsiTheme="majorHAnsi" w:cs="Arial"/>
               </w:rPr>
-              <w:t>).</w:t>
-            </w:r>
-            <w:r>
-              <w:rPr>
-                <w:rFonts w:asciiTheme="majorHAnsi" w:hAnsiTheme="majorHAnsi" w:cs="Arial"/>
-              </w:rPr>
-              <w:t>…………</w:t>
-            </w:r>
-            <w:r>
-              <w:rPr>
-                <w:rFonts w:asciiTheme="majorHAnsi" w:hAnsiTheme="majorHAnsi" w:cs="Arial"/>
-              </w:rPr>
-              <w:t>...</w:t>
-            </w:r>
-            <w:r>
-              <w:rPr>
-                <w:rFonts w:asciiTheme="majorHAnsi" w:hAnsiTheme="majorHAnsi" w:cs="Arial"/>
-              </w:rPr>
-              <w:t>..</w:t>
-            </w:r>
-            <w:r>
-              <w:rPr>
-                <w:rFonts w:asciiTheme="majorHAnsi" w:hAnsiTheme="majorHAnsi" w:cs="Arial"/>
-              </w:rPr>
-              <w:t>.</w:t>
-            </w:r>
-            <w:r>
-              <w:rPr>
-                <w:rFonts w:asciiTheme="majorHAnsi" w:hAnsiTheme="majorHAnsi" w:cs="Arial"/>
-              </w:rPr>
-              <w:t>...........</w:t>
-            </w:r>
-            <w:r>
-              <w:rPr>
-                <w:rFonts w:asciiTheme="majorHAnsi" w:hAnsiTheme="majorHAnsi" w:cs="Arial"/>
-              </w:rPr>
-              <w:t>.</w:t>
-            </w:r>
-            <w:r>
-              <w:rPr>
-                <w:rFonts w:asciiTheme="majorHAnsi" w:hAnsiTheme="majorHAnsi" w:cs="Arial"/>
-              </w:rPr>
-              <w:t>......</w:t>
-            </w:r>
-            <w:r>
-              <w:rPr>
-                <w:rFonts w:asciiTheme="majorHAnsi" w:hAnsiTheme="majorHAnsi" w:cs="Arial"/>
-              </w:rPr>
-              <w:t>..</w:t>
-            </w:r>
-            <w:r>
-              <w:rPr>
-                <w:rFonts w:asciiTheme="majorHAnsi" w:hAnsiTheme="majorHAnsi" w:cs="Arial"/>
-              </w:rPr>
-              <w:t>.....</w:t>
-            </w:r>
-            <w:r>
-              <w:rPr>
-                <w:rFonts w:asciiTheme="majorHAnsi" w:hAnsiTheme="majorHAnsi" w:cs="Arial"/>
-              </w:rPr>
-              <w:t>..</w:t>
+              <w:t>)</w:t>
             </w:r>
             <w:r>
               <w:rPr>
@@ -2244,6 +2514,36 @@
             <w:r>
               <w:rPr>
                 <w:rFonts w:asciiTheme="majorHAnsi" w:hAnsiTheme="majorHAnsi" w:cs="Arial"/>
+                <w:sz w:val="22"/>
+                <w:szCs w:val="22"/>
+              </w:rPr>
+              <w:t>{{ imie_nazwisko_</w:t>
+            </w:r>
+            <w:r>
+              <w:rPr>
+                <w:rFonts w:asciiTheme="majorHAnsi" w:hAnsiTheme="majorHAnsi" w:cs="Arial"/>
+                <w:sz w:val="22"/>
+                <w:szCs w:val="22"/>
+              </w:rPr>
+              <w:t>2</w:t>
+            </w:r>
+            <w:r>
+              <w:rPr>
+                <w:rFonts w:asciiTheme="majorHAnsi" w:hAnsiTheme="majorHAnsi" w:cs="Arial"/>
+                <w:sz w:val="22"/>
+                <w:szCs w:val="22"/>
+              </w:rPr>
+              <w:t xml:space="preserve"> }}</w:t>
+            </w:r>
+            <w:r>
+              <w:rPr>
+                <w:rFonts w:asciiTheme="majorHAnsi" w:hAnsiTheme="majorHAnsi" w:cs="Arial"/>
+              </w:rPr>
+              <w:t xml:space="preserve"> </w:t>
+            </w:r>
+            <w:r>
+              <w:rPr>
+                <w:rFonts w:asciiTheme="majorHAnsi" w:hAnsiTheme="majorHAnsi" w:cs="Arial"/>
               </w:rPr>
               <w:t xml:space="preserve">       3</w:t>
             </w:r>
@@ -2257,55 +2557,37 @@
               <w:rPr>
                 <w:rFonts w:asciiTheme="majorHAnsi" w:hAnsiTheme="majorHAnsi" w:cs="Arial"/>
               </w:rPr>
-              <w:t>…….</w:t>
-            </w:r>
-            <w:r>
-              <w:rPr>
-                <w:rFonts w:asciiTheme="majorHAnsi" w:hAnsiTheme="majorHAnsi" w:cs="Arial"/>
-              </w:rPr>
-              <w:t>.</w:t>
-            </w:r>
-            <w:r>
-              <w:rPr>
-                <w:rFonts w:asciiTheme="majorHAnsi" w:hAnsiTheme="majorHAnsi" w:cs="Arial"/>
-              </w:rPr>
-              <w:t>…</w:t>
-            </w:r>
-            <w:r>
-              <w:rPr>
-                <w:rFonts w:asciiTheme="majorHAnsi" w:hAnsiTheme="majorHAnsi" w:cs="Arial"/>
-              </w:rPr>
-              <w:t>…</w:t>
-            </w:r>
-            <w:r>
-              <w:rPr>
-                <w:rFonts w:asciiTheme="majorHAnsi" w:hAnsiTheme="majorHAnsi" w:cs="Arial"/>
-              </w:rPr>
-              <w:t>………</w:t>
-            </w:r>
-            <w:r>
-              <w:rPr>
-                <w:rFonts w:asciiTheme="majorHAnsi" w:hAnsiTheme="majorHAnsi" w:cs="Arial"/>
-              </w:rPr>
-              <w:t>…</w:t>
-            </w:r>
-            <w:r>
-              <w:rPr>
-                <w:rFonts w:asciiTheme="majorHAnsi" w:hAnsiTheme="majorHAnsi" w:cs="Arial"/>
-              </w:rPr>
-              <w:t>……</w:t>
-            </w:r>
-            <w:r>
-              <w:rPr>
-                <w:rFonts w:asciiTheme="majorHAnsi" w:hAnsiTheme="majorHAnsi" w:cs="Arial"/>
-              </w:rPr>
-              <w:t>…</w:t>
-            </w:r>
-            <w:r>
-              <w:rPr>
-                <w:rFonts w:asciiTheme="majorHAnsi" w:hAnsiTheme="majorHAnsi" w:cs="Arial"/>
-              </w:rPr>
-              <w:t xml:space="preserve">………..   </w:t>
+              <w:t xml:space="preserve"> </w:t>
+            </w:r>
+            <w:r>
+              <w:rPr>
+                <w:rFonts w:asciiTheme="majorHAnsi" w:hAnsiTheme="majorHAnsi" w:cs="Arial"/>
+                <w:sz w:val="22"/>
+                <w:szCs w:val="22"/>
+              </w:rPr>
+              <w:t>{{ imie_nazwisko_</w:t>
+            </w:r>
+            <w:r>
+              <w:rPr>
+                <w:rFonts w:asciiTheme="majorHAnsi" w:hAnsiTheme="majorHAnsi" w:cs="Arial"/>
+                <w:sz w:val="22"/>
+                <w:szCs w:val="22"/>
+              </w:rPr>
+              <w:t>3</w:t>
+            </w:r>
+            <w:r>
+              <w:rPr>
+                <w:rFonts w:asciiTheme="majorHAnsi" w:hAnsiTheme="majorHAnsi" w:cs="Arial"/>
+                <w:sz w:val="22"/>
+                <w:szCs w:val="22"/>
+              </w:rPr>
+              <w:t xml:space="preserve"> }}</w:t>
+            </w:r>
+            <w:r>
+              <w:rPr>
+                <w:rFonts w:asciiTheme="majorHAnsi" w:hAnsiTheme="majorHAnsi" w:cs="Arial"/>
+              </w:rPr>
+              <w:t xml:space="preserve">   </w:t>
             </w:r>
             <w:r>
               <w:rPr>
@@ -2317,43 +2599,37 @@
               <w:rPr>
                 <w:rFonts w:asciiTheme="majorHAnsi" w:hAnsiTheme="majorHAnsi" w:cs="Arial"/>
               </w:rPr>
-              <w:t>).</w:t>
-            </w:r>
-            <w:r>
-              <w:rPr>
-                <w:rFonts w:asciiTheme="majorHAnsi" w:hAnsiTheme="majorHAnsi" w:cs="Arial"/>
-              </w:rPr>
-              <w:t>………</w:t>
-            </w:r>
-            <w:r>
-              <w:rPr>
-                <w:rFonts w:asciiTheme="majorHAnsi" w:hAnsiTheme="majorHAnsi" w:cs="Arial"/>
-              </w:rPr>
-              <w:t>………..</w:t>
-            </w:r>
-            <w:r>
-              <w:rPr>
-                <w:rFonts w:asciiTheme="majorHAnsi" w:hAnsiTheme="majorHAnsi" w:cs="Arial"/>
-              </w:rPr>
-              <w:t>…</w:t>
-            </w:r>
-            <w:r>
-              <w:rPr>
-                <w:rFonts w:asciiTheme="majorHAnsi" w:hAnsiTheme="majorHAnsi" w:cs="Arial"/>
-              </w:rPr>
-              <w:t>….</w:t>
-            </w:r>
-            <w:r>
-              <w:rPr>
-                <w:rFonts w:asciiTheme="majorHAnsi" w:hAnsiTheme="majorHAnsi" w:cs="Arial"/>
-              </w:rPr>
-              <w:t>….</w:t>
-            </w:r>
-            <w:r>
-              <w:rPr>
-                <w:rFonts w:asciiTheme="majorHAnsi" w:hAnsiTheme="majorHAnsi" w:cs="Arial"/>
-              </w:rPr>
-              <w:t>…………</w:t>
+              <w:t>)</w:t>
+            </w:r>
+            <w:r>
+              <w:rPr>
+                <w:rFonts w:asciiTheme="majorHAnsi" w:hAnsiTheme="majorHAnsi" w:cs="Arial"/>
+              </w:rPr>
+              <w:t xml:space="preserve"> </w:t>
+            </w:r>
+            <w:r>
+              <w:rPr>
+                <w:rFonts w:asciiTheme="majorHAnsi" w:hAnsiTheme="majorHAnsi" w:cs="Arial"/>
+                <w:sz w:val="22"/>
+                <w:szCs w:val="22"/>
+              </w:rPr>
+              <w:t>{{ imie_nazwisko_</w:t>
+            </w:r>
+            <w:r>
+              <w:rPr>
+                <w:rFonts w:asciiTheme="majorHAnsi" w:hAnsiTheme="majorHAnsi" w:cs="Arial"/>
+                <w:sz w:val="22"/>
+                <w:szCs w:val="22"/>
+              </w:rPr>
+              <w:t>4</w:t>
+            </w:r>
+            <w:r>
+              <w:rPr>
+                <w:rFonts w:asciiTheme="majorHAnsi" w:hAnsiTheme="majorHAnsi" w:cs="Arial"/>
+                <w:sz w:val="22"/>
+                <w:szCs w:val="22"/>
+              </w:rPr>
+              <w:t xml:space="preserve"> }}</w:t>
             </w:r>
           </w:p>
           <w:p>
@@ -2398,6 +2674,7 @@
           <w:sz w:val="20"/>
           <w:szCs w:val="20"/>
         </w:rPr>
+        <w:lastRenderedPageBreak/>
         <w:t>*)</w:t>
       </w:r>
       <w:r>
@@ -2572,7 +2849,7 @@
 </file>
 
 <file path=word/endnotes.xml><?xml version="1.0" encoding="utf-8"?>
-<w:endnotes xmlns:wpc="http://schemas.microsoft.com/office/word/2010/wordprocessingCanvas" xmlns:cx="http://schemas.microsoft.com/office/drawing/2014/chartex" xmlns:cx1="http://schemas.microsoft.com/office/drawing/2015/9/8/chartex" xmlns:cx2="http://schemas.microsoft.com/office/drawing/2015/10/21/chartex" xmlns:cx3="http://schemas.microsoft.com/office/drawing/2016/5/9/chartex" xmlns:cx4="http://schemas.microsoft.com/office/drawing/2016/5/10/chartex" xmlns:cx5="http://schemas.microsoft.com/office/drawing/2016/5/11/chartex" xmlns:cx6="http://schemas.microsoft.com/office/drawing/2016/5/12/chartex" xmlns:cx7="http://schemas.microsoft.com/office/drawing/2016/5/13/chartex" xmlns:cx8="http://schemas.microsoft.com/office/drawing/2016/5/14/chartex" xmlns:mc="http://schemas.openxmlformats.org/markup-compatibility/2006" xmlns:aink="http://schemas.microsoft.com/office/drawing/2016/ink" xmlns:am3d="http://schemas.microsoft.com/office/drawing/2017/model3d" xmlns:o="urn:schemas-microsoft-com:office:office" xmlns:oel="http://schemas.microsoft.com/office/2019/extlst" xmlns:r="http://schemas.openxmlformats.org/officeDocument/2006/relationships" xmlns:m="http://schemas.openxmlformats.org/officeDocument/2006/math" xmlns:v="urn:schemas-microsoft-com:vml" xmlns:wp14="http://schemas.microsoft.com/office/word/2010/wordprocessingDrawing" xmlns:wp="http://schemas.openxmlformats.org/drawingml/2006/wordprocessingDrawing" xmlns:w10="urn:schemas-microsoft-com:office:word" xmlns:w="http://schemas.openxmlformats.org/wordprocessingml/2006/main" xmlns:w14="http://schemas.microsoft.com/office/word/2010/wordml" xmlns:w15="http://schemas.microsoft.com/office/word/2012/wordml" xmlns:w16cex="http://schemas.microsoft.com/office/word/2018/wordml/cex" xmlns:w16cid="http://schemas.microsoft.com/office/word/2016/wordml/cid" xmlns:w16="http://schemas.microsoft.com/office/word/2018/wordml" xmlns:w16du="http://schemas.microsoft.com/office/word/2023/wordml/word16du" xmlns:w16sdtdh="http://schemas.microsoft.com/office/word/2020/wordml/sdtdatahash" xmlns:w16se="http://schemas.microsoft.com/office/word/2015/wordml/symex" xmlns:wpg="http://schemas.microsoft.com/office/word/2010/wordprocessingGroup" xmlns:wpi="http://schemas.microsoft.com/office/word/2010/wordprocessingInk" xmlns:wne="http://schemas.microsoft.com/office/word/2006/wordml" xmlns:wps="http://schemas.microsoft.com/office/word/2010/wordprocessingShape" mc:Ignorable="w14 w15 w16se w16cid w16 w16cex w16sdtdh w16du wp14">
+<w:endnotes xmlns:wpc="http://schemas.microsoft.com/office/word/2010/wordprocessingCanvas" xmlns:cx="http://schemas.microsoft.com/office/drawing/2014/chartex" xmlns:cx1="http://schemas.microsoft.com/office/drawing/2015/9/8/chartex" xmlns:cx2="http://schemas.microsoft.com/office/drawing/2015/10/21/chartex" xmlns:cx3="http://schemas.microsoft.com/office/drawing/2016/5/9/chartex" xmlns:cx4="http://schemas.microsoft.com/office/drawing/2016/5/10/chartex" xmlns:cx5="http://schemas.microsoft.com/office/drawing/2016/5/11/chartex" xmlns:cx6="http://schemas.microsoft.com/office/drawing/2016/5/12/chartex" xmlns:cx7="http://schemas.microsoft.com/office/drawing/2016/5/13/chartex" xmlns:cx8="http://schemas.microsoft.com/office/drawing/2016/5/14/chartex" xmlns:mc="http://schemas.openxmlformats.org/markup-compatibility/2006" xmlns:aink="http://schemas.microsoft.com/office/drawing/2016/ink" xmlns:am3d="http://schemas.microsoft.com/office/drawing/2017/model3d" xmlns:o="urn:schemas-microsoft-com:office:office" xmlns:oel="http://schemas.microsoft.com/office/2019/extlst" xmlns:r="http://schemas.openxmlformats.org/officeDocument/2006/relationships" xmlns:m="http://schemas.openxmlformats.org/officeDocument/2006/math" xmlns:v="urn:schemas-microsoft-com:vml" xmlns:wp14="http://schemas.microsoft.com/office/word/2010/wordprocessingDrawing" xmlns:wp="http://schemas.openxmlformats.org/drawingml/2006/wordprocessingDrawing" xmlns:w10="urn:schemas-microsoft-com:office:word" xmlns:w="http://schemas.openxmlformats.org/wordprocessingml/2006/main" xmlns:w14="http://schemas.microsoft.com/office/word/2010/wordml" xmlns:w15="http://schemas.microsoft.com/office/word/2012/wordml" xmlns:w16cex="http://schemas.microsoft.com/office/word/2018/wordml/cex" xmlns:w16cid="http://schemas.microsoft.com/office/word/2016/wordml/cid" xmlns:w16="http://schemas.microsoft.com/office/word/2018/wordml" xmlns:w16du="http://schemas.microsoft.com/office/word/2023/wordml/word16du" xmlns:w16sdtdh="http://schemas.microsoft.com/office/word/2020/wordml/sdtdatahash" xmlns:w16sdtfl="http://schemas.microsoft.com/office/word/2024/wordml/sdtformatlock" xmlns:w16se="http://schemas.microsoft.com/office/word/2015/wordml/symex" xmlns:wpg="http://schemas.microsoft.com/office/word/2010/wordprocessingGroup" xmlns:wpi="http://schemas.microsoft.com/office/word/2010/wordprocessingInk" xmlns:wne="http://schemas.microsoft.com/office/word/2006/wordml" xmlns:wps="http://schemas.microsoft.com/office/word/2010/wordprocessingShape" mc:Ignorable="w14 w15 w16se w16cid w16 w16cex w16sdtdh w16sdtfl w16du wp14">
   <w:endnote w:type="separator" w:id="-1">
     <w:p>
       <w:r>
@@ -2591,7 +2868,7 @@
 </file>
 
 <file path=word/footnotes.xml><?xml version="1.0" encoding="utf-8"?>
-<w:footnotes xmlns:wpc="http://schemas.microsoft.com/office/word/2010/wordprocessingCanvas" xmlns:cx="http://schemas.microsoft.com/office/drawing/2014/chartex" xmlns:cx1="http://schemas.microsoft.com/office/drawing/2015/9/8/chartex" xmlns:cx2="http://schemas.microsoft.com/office/drawing/2015/10/21/chartex" xmlns:cx3="http://schemas.microsoft.com/office/drawing/2016/5/9/chartex" xmlns:cx4="http://schemas.microsoft.com/office/drawing/2016/5/10/chartex" xmlns:cx5="http://schemas.microsoft.com/office/drawing/2016/5/11/chartex" xmlns:cx6="http://schemas.microsoft.com/office/drawing/2016/5/12/chartex" xmlns:cx7="http://schemas.microsoft.com/office/drawing/2016/5/13/chartex" xmlns:cx8="http://schemas.microsoft.com/office/drawing/2016/5/14/chartex" xmlns:mc="http://schemas.openxmlformats.org/markup-compatibility/2006" xmlns:aink="http://schemas.microsoft.com/office/drawing/2016/ink" xmlns:am3d="http://schemas.microsoft.com/office/drawing/2017/model3d" xmlns:o="urn:schemas-microsoft-com:office:office" xmlns:oel="http://schemas.microsoft.com/office/2019/extlst" xmlns:r="http://schemas.openxmlformats.org/officeDocument/2006/relationships" xmlns:m="http://schemas.openxmlformats.org/officeDocument/2006/math" xmlns:v="urn:schemas-microsoft-com:vml" xmlns:wp14="http://schemas.microsoft.com/office/word/2010/wordprocessingDrawing" xmlns:wp="http://schemas.openxmlformats.org/drawingml/2006/wordprocessingDrawing" xmlns:w10="urn:schemas-microsoft-com:office:word" xmlns:w="http://schemas.openxmlformats.org/wordprocessingml/2006/main" xmlns:w14="http://schemas.microsoft.com/office/word/2010/wordml" xmlns:w15="http://schemas.microsoft.com/office/word/2012/wordml" xmlns:w16cex="http://schemas.microsoft.com/office/word/2018/wordml/cex" xmlns:w16cid="http://schemas.microsoft.com/office/word/2016/wordml/cid" xmlns:w16="http://schemas.microsoft.com/office/word/2018/wordml" xmlns:w16du="http://schemas.microsoft.com/office/word/2023/wordml/word16du" xmlns:w16sdtdh="http://schemas.microsoft.com/office/word/2020/wordml/sdtdatahash" xmlns:w16se="http://schemas.microsoft.com/office/word/2015/wordml/symex" xmlns:wpg="http://schemas.microsoft.com/office/word/2010/wordprocessingGroup" xmlns:wpi="http://schemas.microsoft.com/office/word/2010/wordprocessingInk" xmlns:wne="http://schemas.microsoft.com/office/word/2006/wordml" xmlns:wps="http://schemas.microsoft.com/office/word/2010/wordprocessingShape" mc:Ignorable="w14 w15 w16se w16cid w16 w16cex w16sdtdh w16du wp14">
+<w:footnotes xmlns:wpc="http://schemas.microsoft.com/office/word/2010/wordprocessingCanvas" xmlns:cx="http://schemas.microsoft.com/office/drawing/2014/chartex" xmlns:cx1="http://schemas.microsoft.com/office/drawing/2015/9/8/chartex" xmlns:cx2="http://schemas.microsoft.com/office/drawing/2015/10/21/chartex" xmlns:cx3="http://schemas.microsoft.com/office/drawing/2016/5/9/chartex" xmlns:cx4="http://schemas.microsoft.com/office/drawing/2016/5/10/chartex" xmlns:cx5="http://schemas.microsoft.com/office/drawing/2016/5/11/chartex" xmlns:cx6="http://schemas.microsoft.com/office/drawing/2016/5/12/chartex" xmlns:cx7="http://schemas.microsoft.com/office/drawing/2016/5/13/chartex" xmlns:cx8="http://schemas.microsoft.com/office/drawing/2016/5/14/chartex" xmlns:mc="http://schemas.openxmlformats.org/markup-compatibility/2006" xmlns:aink="http://schemas.microsoft.com/office/drawing/2016/ink" xmlns:am3d="http://schemas.microsoft.com/office/drawing/2017/model3d" xmlns:o="urn:schemas-microsoft-com:office:office" xmlns:oel="http://schemas.microsoft.com/office/2019/extlst" xmlns:r="http://schemas.openxmlformats.org/officeDocument/2006/relationships" xmlns:m="http://schemas.openxmlformats.org/officeDocument/2006/math" xmlns:v="urn:schemas-microsoft-com:vml" xmlns:wp14="http://schemas.microsoft.com/office/word/2010/wordprocessingDrawing" xmlns:wp="http://schemas.openxmlformats.org/drawingml/2006/wordprocessingDrawing" xmlns:w10="urn:schemas-microsoft-com:office:word" xmlns:w="http://schemas.openxmlformats.org/wordprocessingml/2006/main" xmlns:w14="http://schemas.microsoft.com/office/word/2010/wordml" xmlns:w15="http://schemas.microsoft.com/office/word/2012/wordml" xmlns:w16cex="http://schemas.microsoft.com/office/word/2018/wordml/cex" xmlns:w16cid="http://schemas.microsoft.com/office/word/2016/wordml/cid" xmlns:w16="http://schemas.microsoft.com/office/word/2018/wordml" xmlns:w16du="http://schemas.microsoft.com/office/word/2023/wordml/word16du" xmlns:w16sdtdh="http://schemas.microsoft.com/office/word/2020/wordml/sdtdatahash" xmlns:w16sdtfl="http://schemas.microsoft.com/office/word/2024/wordml/sdtformatlock" xmlns:w16se="http://schemas.microsoft.com/office/word/2015/wordml/symex" xmlns:wpg="http://schemas.microsoft.com/office/word/2010/wordprocessingGroup" xmlns:wpi="http://schemas.microsoft.com/office/word/2010/wordprocessingInk" xmlns:wne="http://schemas.microsoft.com/office/word/2006/wordml" xmlns:wps="http://schemas.microsoft.com/office/word/2010/wordprocessingShape" mc:Ignorable="w14 w15 w16se w16cid w16 w16cex w16sdtdh w16sdtfl w16du wp14">
   <w:footnote w:type="separator" w:id="-1">
     <w:p>
       <w:r>
@@ -2610,7 +2887,7 @@
 </file>
 
 <file path=word/header1.xml><?xml version="1.0" encoding="utf-8"?>
-<w:hdr xmlns:wpc="http://schemas.microsoft.com/office/word/2010/wordprocessingCanvas" xmlns:cx="http://schemas.microsoft.com/office/drawing/2014/chartex" xmlns:cx1="http://schemas.microsoft.com/office/drawing/2015/9/8/chartex" xmlns:cx2="http://schemas.microsoft.com/office/drawing/2015/10/21/chartex" xmlns:cx3="http://schemas.microsoft.com/office/drawing/2016/5/9/chartex" xmlns:cx4="http://schemas.microsoft.com/office/drawing/2016/5/10/chartex" xmlns:cx5="http://schemas.microsoft.com/office/drawing/2016/5/11/chartex" xmlns:cx6="http://schemas.microsoft.com/office/drawing/2016/5/12/chartex" xmlns:cx7="http://schemas.microsoft.com/office/drawing/2016/5/13/chartex" xmlns:cx8="http://schemas.microsoft.com/office/drawing/2016/5/14/chartex" xmlns:mc="http://schemas.openxmlformats.org/markup-compatibility/2006" xmlns:aink="http://schemas.microsoft.com/office/drawing/2016/ink" xmlns:am3d="http://schemas.microsoft.com/office/drawing/2017/model3d" xmlns:o="urn:schemas-microsoft-com:office:office" xmlns:oel="http://schemas.microsoft.com/office/2019/extlst" xmlns:r="http://schemas.openxmlformats.org/officeDocument/2006/relationships" xmlns:m="http://schemas.openxmlformats.org/officeDocument/2006/math" xmlns:v="urn:schemas-microsoft-com:vml" xmlns:wp14="http://schemas.microsoft.com/office/word/2010/wordprocessingDrawing" xmlns:wp="http://schemas.openxmlformats.org/drawingml/2006/wordprocessingDrawing" xmlns:w10="urn:schemas-microsoft-com:office:word" xmlns:w="http://schemas.openxmlformats.org/wordprocessingml/2006/main" xmlns:w14="http://schemas.microsoft.com/office/word/2010/wordml" xmlns:w15="http://schemas.microsoft.com/office/word/2012/wordml" xmlns:w16cex="http://schemas.microsoft.com/office/word/2018/wordml/cex" xmlns:w16cid="http://schemas.microsoft.com/office/word/2016/wordml/cid" xmlns:w16="http://schemas.microsoft.com/office/word/2018/wordml" xmlns:w16du="http://schemas.microsoft.com/office/word/2023/wordml/word16du" xmlns:w16sdtdh="http://schemas.microsoft.com/office/word/2020/wordml/sdtdatahash" xmlns:w16se="http://schemas.microsoft.com/office/word/2015/wordml/symex" xmlns:wpg="http://schemas.microsoft.com/office/word/2010/wordprocessingGroup" xmlns:wpi="http://schemas.microsoft.com/office/word/2010/wordprocessingInk" xmlns:wne="http://schemas.microsoft.com/office/word/2006/wordml" xmlns:wps="http://schemas.microsoft.com/office/word/2010/wordprocessingShape" mc:Ignorable="w14 w15 w16se w16cid w16 w16cex w16sdtdh w16du wp14">
+<w:hdr xmlns:wpc="http://schemas.microsoft.com/office/word/2010/wordprocessingCanvas" xmlns:cx="http://schemas.microsoft.com/office/drawing/2014/chartex" xmlns:cx1="http://schemas.microsoft.com/office/drawing/2015/9/8/chartex" xmlns:cx2="http://schemas.microsoft.com/office/drawing/2015/10/21/chartex" xmlns:cx3="http://schemas.microsoft.com/office/drawing/2016/5/9/chartex" xmlns:cx4="http://schemas.microsoft.com/office/drawing/2016/5/10/chartex" xmlns:cx5="http://schemas.microsoft.com/office/drawing/2016/5/11/chartex" xmlns:cx6="http://schemas.microsoft.com/office/drawing/2016/5/12/chartex" xmlns:cx7="http://schemas.microsoft.com/office/drawing/2016/5/13/chartex" xmlns:cx8="http://schemas.microsoft.com/office/drawing/2016/5/14/chartex" xmlns:mc="http://schemas.openxmlformats.org/markup-compatibility/2006" xmlns:aink="http://schemas.microsoft.com/office/drawing/2016/ink" xmlns:am3d="http://schemas.microsoft.com/office/drawing/2017/model3d" xmlns:o="urn:schemas-microsoft-com:office:office" xmlns:oel="http://schemas.microsoft.com/office/2019/extlst" xmlns:r="http://schemas.openxmlformats.org/officeDocument/2006/relationships" xmlns:m="http://schemas.openxmlformats.org/officeDocument/2006/math" xmlns:v="urn:schemas-microsoft-com:vml" xmlns:wp14="http://schemas.microsoft.com/office/word/2010/wordprocessingDrawing" xmlns:wp="http://schemas.openxmlformats.org/drawingml/2006/wordprocessingDrawing" xmlns:w10="urn:schemas-microsoft-com:office:word" xmlns:w="http://schemas.openxmlformats.org/wordprocessingml/2006/main" xmlns:w14="http://schemas.microsoft.com/office/word/2010/wordml" xmlns:w15="http://schemas.microsoft.com/office/word/2012/wordml" xmlns:w16cex="http://schemas.microsoft.com/office/word/2018/wordml/cex" xmlns:w16cid="http://schemas.microsoft.com/office/word/2016/wordml/cid" xmlns:w16="http://schemas.microsoft.com/office/word/2018/wordml" xmlns:w16du="http://schemas.microsoft.com/office/word/2023/wordml/word16du" xmlns:w16sdtdh="http://schemas.microsoft.com/office/word/2020/wordml/sdtdatahash" xmlns:w16sdtfl="http://schemas.microsoft.com/office/word/2024/wordml/sdtformatlock" xmlns:w16se="http://schemas.microsoft.com/office/word/2015/wordml/symex" xmlns:wpg="http://schemas.microsoft.com/office/word/2010/wordprocessingGroup" xmlns:wpi="http://schemas.microsoft.com/office/word/2010/wordprocessingInk" xmlns:wne="http://schemas.microsoft.com/office/word/2006/wordml" xmlns:wps="http://schemas.microsoft.com/office/word/2010/wordprocessingShape" mc:Ignorable="w14 w15 w16se w16cid w16 w16cex w16sdtdh w16sdtfl w16du wp14">
   <w:p>
     <w:pPr>
       <w:pStyle w:val="Nagwek"/>
@@ -2639,7 +2916,7 @@
 </file>
 
 <file path=word/numbering.xml><?xml version="1.0" encoding="utf-8"?>
-<w:numbering xmlns:wpc="http://schemas.microsoft.com/office/word/2010/wordprocessingCanvas" xmlns:cx="http://schemas.microsoft.com/office/drawing/2014/chartex" xmlns:cx1="http://schemas.microsoft.com/office/drawing/2015/9/8/chartex" xmlns:cx2="http://schemas.microsoft.com/office/drawing/2015/10/21/chartex" xmlns:cx3="http://schemas.microsoft.com/office/drawing/2016/5/9/chartex" xmlns:cx4="http://schemas.microsoft.com/office/drawing/2016/5/10/chartex" xmlns:cx5="http://schemas.microsoft.com/office/drawing/2016/5/11/chartex" xmlns:cx6="http://schemas.microsoft.com/office/drawing/2016/5/12/chartex" xmlns:cx7="http://schemas.microsoft.com/office/drawing/2016/5/13/chartex" xmlns:cx8="http://schemas.microsoft.com/office/drawing/2016/5/14/chartex" xmlns:mc="http://schemas.openxmlformats.org/markup-compatibility/2006" xmlns:aink="http://schemas.microsoft.com/office/drawing/2016/ink" xmlns:am3d="http://schemas.microsoft.com/office/drawing/2017/model3d" xmlns:o="urn:schemas-microsoft-com:office:office" xmlns:oel="http://schemas.microsoft.com/office/2019/extlst" xmlns:r="http://schemas.openxmlformats.org/officeDocument/2006/relationships" xmlns:m="http://schemas.openxmlformats.org/officeDocument/2006/math" xmlns:v="urn:schemas-microsoft-com:vml" xmlns:wp14="http://schemas.microsoft.com/office/word/2010/wordprocessingDrawing" xmlns:wp="http://schemas.openxmlformats.org/drawingml/2006/wordprocessingDrawing" xmlns:w10="urn:schemas-microsoft-com:office:word" xmlns:w="http://schemas.openxmlformats.org/wordprocessingml/2006/main" xmlns:w14="http://schemas.microsoft.com/office/word/2010/wordml" xmlns:w15="http://schemas.microsoft.com/office/word/2012/wordml" xmlns:w16cex="http://schemas.microsoft.com/office/word/2018/wordml/cex" xmlns:w16cid="http://schemas.microsoft.com/office/word/2016/wordml/cid" xmlns:w16="http://schemas.microsoft.com/office/word/2018/wordml" xmlns:w16du="http://schemas.microsoft.com/office/word/2023/wordml/word16du" xmlns:w16sdtdh="http://schemas.microsoft.com/office/word/2020/wordml/sdtdatahash" xmlns:w16se="http://schemas.microsoft.com/office/word/2015/wordml/symex" xmlns:wpg="http://schemas.microsoft.com/office/word/2010/wordprocessingGroup" xmlns:wpi="http://schemas.microsoft.com/office/word/2010/wordprocessingInk" xmlns:wne="http://schemas.microsoft.com/office/word/2006/wordml" xmlns:wps="http://schemas.microsoft.com/office/word/2010/wordprocessingShape" mc:Ignorable="w14 w15 w16se w16cid w16 w16cex w16sdtdh w16du wp14">
+<w:numbering xmlns:wpc="http://schemas.microsoft.com/office/word/2010/wordprocessingCanvas" xmlns:cx="http://schemas.microsoft.com/office/drawing/2014/chartex" xmlns:cx1="http://schemas.microsoft.com/office/drawing/2015/9/8/chartex" xmlns:cx2="http://schemas.microsoft.com/office/drawing/2015/10/21/chartex" xmlns:cx3="http://schemas.microsoft.com/office/drawing/2016/5/9/chartex" xmlns:cx4="http://schemas.microsoft.com/office/drawing/2016/5/10/chartex" xmlns:cx5="http://schemas.microsoft.com/office/drawing/2016/5/11/chartex" xmlns:cx6="http://schemas.microsoft.com/office/drawing/2016/5/12/chartex" xmlns:cx7="http://schemas.microsoft.com/office/drawing/2016/5/13/chartex" xmlns:cx8="http://schemas.microsoft.com/office/drawing/2016/5/14/chartex" xmlns:mc="http://schemas.openxmlformats.org/markup-compatibility/2006" xmlns:aink="http://schemas.microsoft.com/office/drawing/2016/ink" xmlns:am3d="http://schemas.microsoft.com/office/drawing/2017/model3d" xmlns:o="urn:schemas-microsoft-com:office:office" xmlns:oel="http://schemas.microsoft.com/office/2019/extlst" xmlns:r="http://schemas.openxmlformats.org/officeDocument/2006/relationships" xmlns:m="http://schemas.openxmlformats.org/officeDocument/2006/math" xmlns:v="urn:schemas-microsoft-com:vml" xmlns:wp14="http://schemas.microsoft.com/office/word/2010/wordprocessingDrawing" xmlns:wp="http://schemas.openxmlformats.org/drawingml/2006/wordprocessingDrawing" xmlns:w10="urn:schemas-microsoft-com:office:word" xmlns:w="http://schemas.openxmlformats.org/wordprocessingml/2006/main" xmlns:w14="http://schemas.microsoft.com/office/word/2010/wordml" xmlns:w15="http://schemas.microsoft.com/office/word/2012/wordml" xmlns:w16cex="http://schemas.microsoft.com/office/word/2018/wordml/cex" xmlns:w16cid="http://schemas.microsoft.com/office/word/2016/wordml/cid" xmlns:w16="http://schemas.microsoft.com/office/word/2018/wordml" xmlns:w16du="http://schemas.microsoft.com/office/word/2023/wordml/word16du" xmlns:w16sdtdh="http://schemas.microsoft.com/office/word/2020/wordml/sdtdatahash" xmlns:w16sdtfl="http://schemas.microsoft.com/office/word/2024/wordml/sdtformatlock" xmlns:w16se="http://schemas.microsoft.com/office/word/2015/wordml/symex" xmlns:wpg="http://schemas.microsoft.com/office/word/2010/wordprocessingGroup" xmlns:wpi="http://schemas.microsoft.com/office/word/2010/wordprocessingInk" xmlns:wne="http://schemas.microsoft.com/office/word/2006/wordml" xmlns:wps="http://schemas.microsoft.com/office/word/2010/wordprocessingShape" mc:Ignorable="w14 w15 w16se w16cid w16 w16cex w16sdtdh w16sdtfl w16du wp14">
   <w:abstractNum w:abstractNumId="0" w15:restartNumberingAfterBreak="0">
     <w:nsid w:val="28A02FB4"/>
     <w:multiLevelType w:val="hybridMultilevel"/>
@@ -2893,7 +3170,7 @@
 </file>
 
 <file path=word/styles.xml><?xml version="1.0" encoding="utf-8"?>
-<w:styles xmlns:mc="http://schemas.openxmlformats.org/markup-compatibility/2006" xmlns:r="http://schemas.openxmlformats.org/officeDocument/2006/relationships" xmlns:w="http://schemas.openxmlformats.org/wordprocessingml/2006/main" xmlns:w14="http://schemas.microsoft.com/office/word/2010/wordml" xmlns:w15="http://schemas.microsoft.com/office/word/2012/wordml" xmlns:w16cex="http://schemas.microsoft.com/office/word/2018/wordml/cex" xmlns:w16cid="http://schemas.microsoft.com/office/word/2016/wordml/cid" xmlns:w16="http://schemas.microsoft.com/office/word/2018/wordml" xmlns:w16du="http://schemas.microsoft.com/office/word/2023/wordml/word16du" xmlns:w16sdtdh="http://schemas.microsoft.com/office/word/2020/wordml/sdtdatahash" xmlns:w16se="http://schemas.microsoft.com/office/word/2015/wordml/symex" mc:Ignorable="w14 w15 w16se w16cid w16 w16cex w16sdtdh w16du">
+<w:styles xmlns:mc="http://schemas.openxmlformats.org/markup-compatibility/2006" xmlns:r="http://schemas.openxmlformats.org/officeDocument/2006/relationships" xmlns:w="http://schemas.openxmlformats.org/wordprocessingml/2006/main" xmlns:w14="http://schemas.microsoft.com/office/word/2010/wordml" xmlns:w15="http://schemas.microsoft.com/office/word/2012/wordml" xmlns:w16cex="http://schemas.microsoft.com/office/word/2018/wordml/cex" xmlns:w16cid="http://schemas.microsoft.com/office/word/2016/wordml/cid" xmlns:w16="http://schemas.microsoft.com/office/word/2018/wordml" xmlns:w16du="http://schemas.microsoft.com/office/word/2023/wordml/word16du" xmlns:w16sdtdh="http://schemas.microsoft.com/office/word/2020/wordml/sdtdatahash" xmlns:w16sdtfl="http://schemas.microsoft.com/office/word/2024/wordml/sdtformatlock" xmlns:w16se="http://schemas.microsoft.com/office/word/2015/wordml/symex" mc:Ignorable="w14 w15 w16se w16cid w16 w16cex w16sdtdh w16sdtfl w16du">
   <w:docDefaults>
     <w:rPrDefault>
       <w:rPr>

</xml_diff>